<commit_message>
Support per-column base stiffness in FEM assembly
</commit_message>
<xml_diff>
--- a/main/vHS_results.docx
+++ b/main/vHS_results.docx
@@ -129,10 +129,81 @@
       <w:r>
         <w:t>3</w:t>
       </w:r>
+    </w:p>
+    <w:p/>
+    <w:p/>
+    <w:p/>
+    <w:p/>
+    <w:p/>
+    <w:p/>
+    <w:p/>
+    <w:p/>
+    <w:p/>
+    <w:p/>
+    <w:p/>
+    <w:p/>
+    <w:p>
+      <w:r>
+        <w:lastRenderedPageBreak/>
+        <w:drawing>
+          <wp:inline distT="0" distB="0" distL="0" distR="0" wp14:anchorId="525A5D4A" wp14:editId="79F4E3CA">
+            <wp:extent cx="5943600" cy="3627120"/>
+            <wp:effectExtent l="0" t="0" r="0" b="0"/>
+            <wp:docPr id="3" name="Picture 3"/>
+            <wp:cNvGraphicFramePr>
+              <a:graphicFrameLocks xmlns:a="http://schemas.openxmlformats.org/drawingml/2006/main" noChangeAspect="1"/>
+            </wp:cNvGraphicFramePr>
+            <a:graphic xmlns:a="http://schemas.openxmlformats.org/drawingml/2006/main">
+              <a:graphicData uri="http://schemas.openxmlformats.org/drawingml/2006/picture">
+                <pic:pic xmlns:pic="http://schemas.openxmlformats.org/drawingml/2006/picture">
+                  <pic:nvPicPr>
+                    <pic:cNvPr id="1" name=""/>
+                    <pic:cNvPicPr/>
+                  </pic:nvPicPr>
+                  <pic:blipFill>
+                    <a:blip r:embed="rId6"/>
+                    <a:stretch>
+                      <a:fillRect/>
+                    </a:stretch>
+                  </pic:blipFill>
+                  <pic:spPr>
+                    <a:xfrm>
+                      <a:off x="0" y="0"/>
+                      <a:ext cx="5943600" cy="3627120"/>
+                    </a:xfrm>
+                    <a:prstGeom prst="rect">
+                      <a:avLst/>
+                    </a:prstGeom>
+                  </pic:spPr>
+                </pic:pic>
+              </a:graphicData>
+            </a:graphic>
+          </wp:inline>
+        </w:drawing>
+      </w:r>
+    </w:p>
+    <w:p>
+      <w:r>
+        <w:t>Fem 2</w:t>
+      </w:r>
+    </w:p>
+    <w:p>
+      <w:r>
+        <w:t>1 pole 1 zero delay comp</w:t>
+      </w:r>
       <w:bookmarkStart w:id="0" w:name="_GoBack"/>
       <w:bookmarkEnd w:id="0"/>
     </w:p>
-    <w:p/>
+    <w:p>
+      <w:proofErr w:type="spellStart"/>
+      <w:r>
+        <w:t>Ncf</w:t>
+      </w:r>
+      <w:proofErr w:type="spellEnd"/>
+      <w:r>
+        <w:t xml:space="preserve"> 0.3</w:t>
+      </w:r>
+    </w:p>
     <w:sectPr>
       <w:pgSz w:w="12240" w:h="15840"/>
       <w:pgMar w:top="1440" w:right="1440" w:bottom="1440" w:left="1440" w:header="720" w:footer="720" w:gutter="0"/>
@@ -540,7 +611,7 @@
   <w:style w:type="paragraph" w:default="1" w:styleId="Normal">
     <w:name w:val="Normal"/>
     <w:qFormat/>
-    <w:rsid w:val="00AB3551"/>
+    <w:rsid w:val="00337696"/>
   </w:style>
   <w:style w:type="character" w:default="1" w:styleId="DefaultParagraphFont">
     <w:name w:val="Default Paragraph Font"/>

</xml_diff>